<commit_message>
eCRF: bezoekmappen volledig gelijkgezet met Per nummer
De vergelijking van alle 54 genummerde documenten tegen hun kopieen in
Per visite bracht drie dingen aan het licht.

Voor 45b, 46 en 47 was Per visite juist de nieuwere versie, niet de oudere:
schrijflijnen in het dagboek, en protocolverwijzingen naar par. 6 en par. 5.5.6
in de veiligheids- en ulcusformulieren. Die zijn daarom naar Per nummer
teruggezet in plaats van omgekeerd.

Vijf documenten ontbraken volledig in de bezoekmappen. De pedar-SOP 09b staat nu
bij V1, V2, V4, V6 en V8, de visites waar druk gemeten wordt, naast de SOP's voor
de MoveMonitor en de Orthotimer. De iMCQ en iPCQ, documenten 34, 34b, 35 en 35b,
staan nu bij V3 tot V8, conform het eCRF-register.

Eindstand: 54 nummers in beide mappen, nul inhoudelijke verschillen, niets
ontbrekend en niets overtolligs.

Co-Authored-By: Claude Opus 5 <noreply@anthropic.com>
</commit_message>
<xml_diff>
--- a/(e)CRF/Per nummer/46_AE-SAE Report Form.docx
+++ b/(e)CRF/Per nummer/46_AE-SAE Report Form.docx
@@ -5,16 +5,12 @@
     <w:p>
       <w:pPr>
         <w:jc w:val="center"/>
-        <w:rPr>
-          <w:lang w:val="nl-BE"/>
-        </w:rPr>
       </w:pPr>
       <w:r>
         <w:rPr>
           <w:b/>
           <w:color w:val="123A5F"/>
           <w:sz w:val="28"/>
-          <w:lang w:val="nl-BE"/>
         </w:rPr>
         <w:t>eCRF Document 46: Melding ongewenst voorval (AE/SAE Report Form)</w:t>
       </w:r>
@@ -30,41 +26,14 @@
       </w:r>
     </w:p>
     <w:p>
-      <w:pPr>
-        <w:numPr>
-          <w:ilvl w:val="0"/>
-          <w:numId w:val="14"/>
-        </w:numPr>
-        <w:tabs>
-          <w:tab w:val="left" w:leader="underscore" w:pos="8505"/>
-        </w:tabs>
-        <w:spacing w:line="360" w:lineRule="auto"/>
-        <w:rPr>
-          <w:rFonts w:ascii="Calibri" w:hAnsi="Calibri" w:cs="Calibri"/>
-        </w:rPr>
-      </w:pPr>
       <w:r>
         <w:rPr>
           <w:color w:val="24303B"/>
         </w:rPr>
-        <w:t>Studie titel: Towards Pressure-Adherence &amp; Education Driven Service in Diabetic Foot Disease (PARADISE trial)</w:t>
-      </w:r>
-    </w:p>
-    <w:p>
-      <w:pPr>
-        <w:numPr>
-          <w:ilvl w:val="0"/>
-          <w:numId w:val="14"/>
-        </w:numPr>
-        <w:tabs>
-          <w:tab w:val="left" w:leader="underscore" w:pos="8505"/>
-        </w:tabs>
-        <w:spacing w:line="360" w:lineRule="auto"/>
-        <w:rPr>
-          <w:rFonts w:ascii="Calibri" w:hAnsi="Calibri" w:cs="Calibri"/>
-          <w:lang w:val="nl-BE"/>
-        </w:rPr>
-      </w:pPr>
+        <w:t>Studietitel: Towards Pressure-Adherence &amp; Education Driven Service in Diabetic Foot Disease (PARADISE trial)</w:t>
+      </w:r>
+    </w:p>
+    <w:p>
       <w:r>
         <w:rPr>
           <w:color w:val="24303B"/>
@@ -73,99 +42,39 @@
       </w:r>
     </w:p>
     <w:p>
-      <w:pPr>
-        <w:numPr>
-          <w:ilvl w:val="0"/>
-          <w:numId w:val="14"/>
-        </w:numPr>
-        <w:tabs>
-          <w:tab w:val="left" w:leader="underscore" w:pos="8505"/>
-        </w:tabs>
-        <w:spacing w:line="360" w:lineRule="auto"/>
-        <w:rPr>
-          <w:rFonts w:ascii="Calibri" w:hAnsi="Calibri" w:cs="Calibri"/>
-        </w:rPr>
-      </w:pPr>
       <w:r>
         <w:rPr>
           <w:color w:val="24303B"/>
         </w:rPr>
         <w:t xml:space="preserve">Studielocatie: </w:t>
-      </w:r>
+        <w:tab/>
+      </w:r>
+    </w:p>
+    <w:p>
       <w:r>
         <w:rPr>
           <w:color w:val="24303B"/>
         </w:rPr>
+        <w:t xml:space="preserve">Hoofdonderzoeker (PI): </w:t>
         <w:tab/>
       </w:r>
     </w:p>
     <w:p>
-      <w:pPr>
-        <w:numPr>
-          <w:ilvl w:val="0"/>
-          <w:numId w:val="14"/>
-        </w:numPr>
-        <w:tabs>
-          <w:tab w:val="left" w:leader="underscore" w:pos="8505"/>
-        </w:tabs>
-        <w:spacing w:line="360" w:lineRule="auto"/>
-        <w:rPr>
-          <w:rFonts w:ascii="Calibri" w:hAnsi="Calibri" w:cs="Calibri"/>
-        </w:rPr>
-      </w:pPr>
       <w:r>
         <w:rPr>
           <w:color w:val="24303B"/>
         </w:rPr>
-        <w:t xml:space="preserve">Hoofdonderzoeker (PI): </w:t>
-      </w:r>
-      <w:r>
-        <w:rPr>
-          <w:color w:val="24303B"/>
-        </w:rPr>
+        <w:t xml:space="preserve">Deelnemerscode: </w:t>
         <w:tab/>
       </w:r>
     </w:p>
     <w:p>
-      <w:pPr>
-        <w:numPr>
-          <w:ilvl w:val="0"/>
-          <w:numId w:val="14"/>
-        </w:numPr>
-        <w:tabs>
-          <w:tab w:val="left" w:leader="underscore" w:pos="8505"/>
-        </w:tabs>
-        <w:spacing w:line="360" w:lineRule="auto"/>
-        <w:rPr>
-          <w:rFonts w:ascii="Calibri" w:hAnsi="Calibri" w:cs="Calibri"/>
-        </w:rPr>
-      </w:pPr>
-      <w:r>
-        <w:rPr>
-          <w:color w:val="24303B"/>
-        </w:rPr>
-        <w:t xml:space="preserve">Deelnemerscode: </w:t>
-      </w:r>
-      <w:r>
-        <w:rPr>
-          <w:color w:val="24303B"/>
-        </w:rPr>
-        <w:tab/>
-      </w:r>
-    </w:p>
-    <w:p>
-      <w:pPr>
-        <w:rPr>
-          <w:lang w:val="nl-BE"/>
-        </w:rPr>
-      </w:pPr>
-      <w:r>
-        <w:rPr>
-          <w:color w:val="000000"/>
-          <w:sz w:val="24"/>
-          <w:lang w:val="nl-BE"/>
-        </w:rPr>
-        <w:t>In te vullen door de behandelend arts of PI, bij kennisname van elk ongewenst voorval (adverse event, AE) of ernstig ongewenst voorval (serious adverse event, SAE).</w:t>
+      <w:r>
+        <w:rPr>
+          <w:color w:val="000000"/>
+          <w:sz w:val="24"/>
+        </w:rPr>
+        <w:t>In te vullen door de behandelend arts of PI, bij kennisname van elk ongewenst voorval (adverse event, AE) of ernstig ongewenst voorval (serious adverse event, SAE), conform §6 (Assessments of Safety) van het protocol.</w:t>
       </w:r>
     </w:p>
     <w:p>
@@ -177,124 +86,74 @@
       </w:r>
     </w:p>
     <w:p>
-      <w:pPr>
-        <w:rPr>
-          <w:lang w:val="nl-BE"/>
-        </w:rPr>
-      </w:pPr>
-      <w:r>
-        <w:rPr>
-          <w:color w:val="000000"/>
-          <w:sz w:val="24"/>
-          <w:lang w:val="nl-BE"/>
+      <w:r>
+        <w:rPr>
+          <w:color w:val="000000"/>
+          <w:sz w:val="24"/>
         </w:rPr>
         <w:t xml:space="preserve">Datum kennisname event: ____ / ____ / ______ </w:t>
       </w:r>
     </w:p>
     <w:p>
-      <w:pPr>
-        <w:rPr>
-          <w:lang w:val="nl-BE"/>
-        </w:rPr>
-      </w:pPr>
-      <w:r>
-        <w:rPr>
-          <w:color w:val="000000"/>
-          <w:sz w:val="24"/>
-          <w:lang w:val="nl-BE"/>
+      <w:r>
+        <w:rPr>
+          <w:color w:val="000000"/>
+          <w:sz w:val="24"/>
         </w:rPr>
         <w:t xml:space="preserve">Datum aanvang event (indien gekend): ____ / ____ / ______ </w:t>
       </w:r>
     </w:p>
     <w:p>
-      <w:pPr>
-        <w:rPr>
-          <w:lang w:val="nl-BE"/>
-        </w:rPr>
-      </w:pPr>
-      <w:r>
-        <w:rPr>
-          <w:color w:val="000000"/>
-          <w:sz w:val="24"/>
-          <w:lang w:val="nl-BE"/>
+      <w:r>
+        <w:rPr>
+          <w:color w:val="000000"/>
+          <w:sz w:val="24"/>
         </w:rPr>
         <w:t xml:space="preserve">Beschrijving van het event: </w:t>
       </w:r>
     </w:p>
     <w:p>
-      <w:pPr>
-        <w:rPr>
-          <w:lang w:val="nl-BE"/>
-        </w:rPr>
-      </w:pPr>
-      <w:r>
-        <w:rPr>
-          <w:color w:val="000000"/>
-          <w:sz w:val="24"/>
-          <w:lang w:val="nl-BE"/>
-        </w:rPr>
-        <w:t>___________________________________________________________________</w:t>
-      </w:r>
-      <w:r>
-        <w:rPr>
-          <w:color w:val="000000"/>
-          <w:sz w:val="24"/>
-          <w:lang w:val="nl-BE"/>
-        </w:rPr>
-        <w:t>___________________________________________________________________</w:t>
-      </w:r>
-      <w:r>
-        <w:rPr>
-          <w:color w:val="000000"/>
-          <w:sz w:val="24"/>
-          <w:lang w:val="nl-BE"/>
-        </w:rPr>
-        <w:br/>
-        <w:t>_________________________________________________________________________________________________________________________________________________________________________________________________________</w:t>
-      </w:r>
-    </w:p>
-    <w:p>
-      <w:pPr>
-        <w:rPr>
-          <w:lang w:val="nl-BE"/>
-        </w:rPr>
-      </w:pPr>
-      <w:r>
-        <w:rPr>
-          <w:color w:val="000000"/>
-          <w:sz w:val="24"/>
-          <w:lang w:val="nl-BE"/>
+      <w:r>
+        <w:rPr>
+          <w:color w:val="000000"/>
+          <w:sz w:val="24"/>
+        </w:rPr>
+        <w:t xml:space="preserve">_____________________________________________________________________ </w:t>
+      </w:r>
+    </w:p>
+    <w:p>
+      <w:r>
+        <w:rPr>
+          <w:color w:val="000000"/>
+          <w:sz w:val="24"/>
+        </w:rPr>
+        <w:t xml:space="preserve">_____________________________________________________________________ </w:t>
+      </w:r>
+    </w:p>
+    <w:p>
+      <w:r>
+        <w:rPr>
+          <w:color w:val="000000"/>
+          <w:sz w:val="24"/>
         </w:rPr>
         <w:t xml:space="preserve">Betrokken lichaamsdeel/orgaan (indien van toepassing): ____________________ </w:t>
       </w:r>
     </w:p>
     <w:p>
-      <w:pPr>
-        <w:rPr>
-          <w:lang w:val="nl-BE"/>
-        </w:rPr>
-      </w:pPr>
-      <w:r>
-        <w:rPr>
-          <w:color w:val="000000"/>
-          <w:sz w:val="24"/>
-          <w:lang w:val="nl-BE"/>
+      <w:r>
+        <w:rPr>
+          <w:color w:val="000000"/>
+          <w:sz w:val="24"/>
         </w:rPr>
         <w:t xml:space="preserve">Gerelateerd aan een voetulcus eerder geclassificeerd via eCRF-document 36 (PEDIS) of 38 (WIfI)? </w:t>
       </w:r>
     </w:p>
     <w:p>
-      <w:pPr>
-        <w:rPr>
-          <w:lang w:val="nl-BE"/>
-        </w:rPr>
-      </w:pPr>
       <w:r>
         <w:rPr>
           <w:rFonts w:ascii="Segoe UI Symbol" w:hAnsi="Segoe UI Symbol"/>
           <w:color w:val="000000"/>
           <w:sz w:val="24"/>
-          <w:lang w:val="nl-BE"/>
         </w:rPr>
         <w:t>☐</w:t>
       </w:r>
@@ -302,23 +161,16 @@
         <w:rPr>
           <w:color w:val="000000"/>
           <w:sz w:val="24"/>
-          <w:lang w:val="nl-BE"/>
         </w:rPr>
         <w:t xml:space="preserve"> Ja </w:t>
       </w:r>
     </w:p>
     <w:p>
-      <w:pPr>
-        <w:rPr>
-          <w:lang w:val="nl-BE"/>
-        </w:rPr>
-      </w:pPr>
       <w:r>
         <w:rPr>
           <w:rFonts w:ascii="Segoe UI Symbol" w:hAnsi="Segoe UI Symbol"/>
           <w:color w:val="000000"/>
           <w:sz w:val="24"/>
-          <w:lang w:val="nl-BE"/>
         </w:rPr>
         <w:t>☐</w:t>
       </w:r>
@@ -326,23 +178,16 @@
         <w:rPr>
           <w:color w:val="000000"/>
           <w:sz w:val="24"/>
-          <w:lang w:val="nl-BE"/>
         </w:rPr>
         <w:t xml:space="preserve"> Nee </w:t>
       </w:r>
     </w:p>
     <w:p>
-      <w:pPr>
-        <w:rPr>
-          <w:lang w:val="nl-BE"/>
-        </w:rPr>
-      </w:pPr>
       <w:r>
         <w:rPr>
           <w:rFonts w:ascii="Segoe UI Symbol" w:hAnsi="Segoe UI Symbol"/>
           <w:color w:val="000000"/>
           <w:sz w:val="24"/>
-          <w:lang w:val="nl-BE"/>
         </w:rPr>
         <w:t>☐</w:t>
       </w:r>
@@ -350,105 +195,52 @@
         <w:rPr>
           <w:color w:val="000000"/>
           <w:sz w:val="24"/>
-          <w:lang w:val="nl-BE"/>
         </w:rPr>
         <w:t xml:space="preserve"> Niet van toepassing </w:t>
       </w:r>
     </w:p>
     <w:p>
-      <w:pPr>
-        <w:rPr>
-          <w:color w:val="000000"/>
-          <w:sz w:val="24"/>
-          <w:lang w:val="nl-BE"/>
-        </w:rPr>
-      </w:pPr>
-      <w:r>
-        <w:rPr>
-          <w:color w:val="000000"/>
-          <w:sz w:val="24"/>
-          <w:lang w:val="nl-BE"/>
+      <w:r>
+        <w:rPr>
+          <w:color w:val="000000"/>
+          <w:sz w:val="24"/>
         </w:rPr>
         <w:t xml:space="preserve">Zo ja, documentnummer/datum van die classificatie: ________________________ </w:t>
       </w:r>
     </w:p>
     <w:p>
       <w:pPr>
-        <w:rPr>
-          <w:color w:val="000000"/>
-          <w:sz w:val="24"/>
-          <w:lang w:val="nl-BE"/>
-        </w:rPr>
-      </w:pPr>
-    </w:p>
-    <w:p>
-      <w:pPr>
-        <w:rPr>
-          <w:color w:val="000000"/>
-          <w:sz w:val="24"/>
-          <w:lang w:val="nl-BE"/>
-        </w:rPr>
-      </w:pPr>
-    </w:p>
-    <w:p>
-      <w:pPr>
-        <w:rPr>
-          <w:lang w:val="nl-BE"/>
-        </w:rPr>
-      </w:pPr>
-    </w:p>
-    <w:p>
-      <w:pPr>
         <w:pStyle w:val="Stijl3"/>
       </w:pPr>
       <w:r>
-        <w:lastRenderedPageBreak/>
         <w:t>2. Ernst</w:t>
       </w:r>
     </w:p>
     <w:p>
-      <w:pPr>
-        <w:rPr>
-          <w:lang w:val="nl-BE"/>
-        </w:rPr>
-      </w:pPr>
-      <w:r>
-        <w:rPr>
-          <w:color w:val="000000"/>
-          <w:sz w:val="24"/>
-          <w:lang w:val="nl-BE"/>
+      <w:r>
+        <w:rPr>
+          <w:color w:val="000000"/>
+          <w:sz w:val="24"/>
         </w:rPr>
         <w:t>Een ernstig ongewenst voorval (SAE) is elk event dat resulteert in: overlijden, een levensbedreigende situatie, hospitalisatie of verlenging van bestaande hospitalisatie, blijvende of significante invaliditeit, een aangeboren afwijking, of een andere belangrijke medische gebeurtenis.</w:t>
       </w:r>
     </w:p>
     <w:p>
-      <w:pPr>
-        <w:rPr>
-          <w:lang w:val="nl-BE"/>
-        </w:rPr>
-      </w:pPr>
       <w:r>
         <w:rPr>
           <w:b/>
           <w:color w:val="000000"/>
           <w:sz w:val="24"/>
-          <w:lang w:val="nl-BE"/>
         </w:rPr>
         <w:t>Classificatie:</w:t>
       </w:r>
     </w:p>
     <w:p>
-      <w:pPr>
-        <w:rPr>
-          <w:lang w:val="nl-BE"/>
-        </w:rPr>
-      </w:pPr>
       <w:r>
         <w:rPr>
           <w:rFonts w:ascii="Segoe UI Symbol" w:hAnsi="Segoe UI Symbol"/>
           <w:color w:val="000000"/>
           <w:sz w:val="24"/>
-          <w:lang w:val="nl-BE"/>
         </w:rPr>
         <w:t>☐</w:t>
       </w:r>
@@ -456,23 +248,16 @@
         <w:rPr>
           <w:color w:val="000000"/>
           <w:sz w:val="24"/>
-          <w:lang w:val="nl-BE"/>
         </w:rPr>
         <w:t xml:space="preserve"> Ongewenst voorval (AE) </w:t>
       </w:r>
     </w:p>
     <w:p>
-      <w:pPr>
-        <w:rPr>
-          <w:lang w:val="nl-BE"/>
-        </w:rPr>
-      </w:pPr>
       <w:r>
         <w:rPr>
           <w:rFonts w:ascii="Segoe UI Symbol" w:hAnsi="Segoe UI Symbol"/>
           <w:color w:val="000000"/>
           <w:sz w:val="24"/>
-          <w:lang w:val="nl-BE"/>
         </w:rPr>
         <w:t>☐</w:t>
       </w:r>
@@ -480,39 +265,26 @@
         <w:rPr>
           <w:color w:val="000000"/>
           <w:sz w:val="24"/>
-          <w:lang w:val="nl-BE"/>
         </w:rPr>
         <w:t xml:space="preserve"> Ernstig ongewenst voorval (SAE) </w:t>
       </w:r>
     </w:p>
     <w:p>
-      <w:pPr>
-        <w:rPr>
-          <w:lang w:val="nl-BE"/>
-        </w:rPr>
-      </w:pPr>
       <w:r>
         <w:rPr>
           <w:b/>
           <w:color w:val="000000"/>
           <w:sz w:val="24"/>
-          <w:lang w:val="nl-BE"/>
         </w:rPr>
         <w:t>Indien SAE, reden ernstig (meerdere mogelijk):</w:t>
       </w:r>
     </w:p>
     <w:p>
-      <w:pPr>
-        <w:rPr>
-          <w:lang w:val="nl-BE"/>
-        </w:rPr>
-      </w:pPr>
       <w:r>
         <w:rPr>
           <w:rFonts w:ascii="Segoe UI Symbol" w:hAnsi="Segoe UI Symbol"/>
           <w:color w:val="000000"/>
           <w:sz w:val="24"/>
-          <w:lang w:val="nl-BE"/>
         </w:rPr>
         <w:t>☐</w:t>
       </w:r>
@@ -520,23 +292,16 @@
         <w:rPr>
           <w:color w:val="000000"/>
           <w:sz w:val="24"/>
-          <w:lang w:val="nl-BE"/>
         </w:rPr>
         <w:t xml:space="preserve"> Overlijden </w:t>
       </w:r>
     </w:p>
     <w:p>
-      <w:pPr>
-        <w:rPr>
-          <w:lang w:val="nl-BE"/>
-        </w:rPr>
-      </w:pPr>
       <w:r>
         <w:rPr>
           <w:rFonts w:ascii="Segoe UI Symbol" w:hAnsi="Segoe UI Symbol"/>
           <w:color w:val="000000"/>
           <w:sz w:val="24"/>
-          <w:lang w:val="nl-BE"/>
         </w:rPr>
         <w:t>☐</w:t>
       </w:r>
@@ -544,23 +309,16 @@
         <w:rPr>
           <w:color w:val="000000"/>
           <w:sz w:val="24"/>
-          <w:lang w:val="nl-BE"/>
         </w:rPr>
         <w:t xml:space="preserve"> Levensbedreigend </w:t>
       </w:r>
     </w:p>
     <w:p>
-      <w:pPr>
-        <w:rPr>
-          <w:lang w:val="nl-BE"/>
-        </w:rPr>
-      </w:pPr>
       <w:r>
         <w:rPr>
           <w:rFonts w:ascii="Segoe UI Symbol" w:hAnsi="Segoe UI Symbol"/>
           <w:color w:val="000000"/>
           <w:sz w:val="24"/>
-          <w:lang w:val="nl-BE"/>
         </w:rPr>
         <w:t>☐</w:t>
       </w:r>
@@ -568,23 +326,16 @@
         <w:rPr>
           <w:color w:val="000000"/>
           <w:sz w:val="24"/>
-          <w:lang w:val="nl-BE"/>
         </w:rPr>
         <w:t xml:space="preserve"> Hospitalisatie of verlenging van hospitalisatie </w:t>
       </w:r>
     </w:p>
     <w:p>
-      <w:pPr>
-        <w:rPr>
-          <w:lang w:val="nl-BE"/>
-        </w:rPr>
-      </w:pPr>
       <w:r>
         <w:rPr>
           <w:rFonts w:ascii="Segoe UI Symbol" w:hAnsi="Segoe UI Symbol"/>
           <w:color w:val="000000"/>
           <w:sz w:val="24"/>
-          <w:lang w:val="nl-BE"/>
         </w:rPr>
         <w:t>☐</w:t>
       </w:r>
@@ -592,23 +343,16 @@
         <w:rPr>
           <w:color w:val="000000"/>
           <w:sz w:val="24"/>
-          <w:lang w:val="nl-BE"/>
         </w:rPr>
         <w:t xml:space="preserve"> Blijvende of significante invaliditeit </w:t>
       </w:r>
     </w:p>
     <w:p>
-      <w:pPr>
-        <w:rPr>
-          <w:lang w:val="nl-BE"/>
-        </w:rPr>
-      </w:pPr>
       <w:r>
         <w:rPr>
           <w:rFonts w:ascii="Segoe UI Symbol" w:hAnsi="Segoe UI Symbol"/>
           <w:color w:val="000000"/>
           <w:sz w:val="24"/>
-          <w:lang w:val="nl-BE"/>
         </w:rPr>
         <w:t>☐</w:t>
       </w:r>
@@ -616,23 +360,16 @@
         <w:rPr>
           <w:color w:val="000000"/>
           <w:sz w:val="24"/>
-          <w:lang w:val="nl-BE"/>
         </w:rPr>
         <w:t xml:space="preserve"> Aangeboren afwijking </w:t>
       </w:r>
     </w:p>
     <w:p>
-      <w:pPr>
-        <w:rPr>
-          <w:lang w:val="nl-BE"/>
-        </w:rPr>
-      </w:pPr>
       <w:r>
         <w:rPr>
           <w:rFonts w:ascii="Segoe UI Symbol" w:hAnsi="Segoe UI Symbol"/>
           <w:color w:val="000000"/>
           <w:sz w:val="24"/>
-          <w:lang w:val="nl-BE"/>
         </w:rPr>
         <w:t>☐</w:t>
       </w:r>
@@ -640,39 +377,26 @@
         <w:rPr>
           <w:color w:val="000000"/>
           <w:sz w:val="24"/>
-          <w:lang w:val="nl-BE"/>
         </w:rPr>
         <w:t xml:space="preserve"> Andere belangrijke medische gebeurtenis </w:t>
       </w:r>
     </w:p>
     <w:p>
-      <w:pPr>
-        <w:rPr>
-          <w:lang w:val="nl-BE"/>
-        </w:rPr>
-      </w:pPr>
       <w:r>
         <w:rPr>
           <w:b/>
           <w:color w:val="000000"/>
           <w:sz w:val="24"/>
-          <w:lang w:val="nl-BE"/>
         </w:rPr>
         <w:t>Ernstgraad:</w:t>
       </w:r>
     </w:p>
     <w:p>
-      <w:pPr>
-        <w:rPr>
-          <w:lang w:val="nl-BE"/>
-        </w:rPr>
-      </w:pPr>
       <w:r>
         <w:rPr>
           <w:rFonts w:ascii="Segoe UI Symbol" w:hAnsi="Segoe UI Symbol"/>
           <w:color w:val="000000"/>
           <w:sz w:val="24"/>
-          <w:lang w:val="nl-BE"/>
         </w:rPr>
         <w:t>☐</w:t>
       </w:r>
@@ -680,23 +404,16 @@
         <w:rPr>
           <w:color w:val="000000"/>
           <w:sz w:val="24"/>
-          <w:lang w:val="nl-BE"/>
         </w:rPr>
         <w:t xml:space="preserve"> Mild </w:t>
       </w:r>
     </w:p>
     <w:p>
-      <w:pPr>
-        <w:rPr>
-          <w:lang w:val="nl-BE"/>
-        </w:rPr>
-      </w:pPr>
       <w:r>
         <w:rPr>
           <w:rFonts w:ascii="Segoe UI Symbol" w:hAnsi="Segoe UI Symbol"/>
           <w:color w:val="000000"/>
           <w:sz w:val="24"/>
-          <w:lang w:val="nl-BE"/>
         </w:rPr>
         <w:t>☐</w:t>
       </w:r>
@@ -704,23 +421,16 @@
         <w:rPr>
           <w:color w:val="000000"/>
           <w:sz w:val="24"/>
-          <w:lang w:val="nl-BE"/>
         </w:rPr>
         <w:t xml:space="preserve"> Matig </w:t>
       </w:r>
     </w:p>
     <w:p>
-      <w:pPr>
-        <w:rPr>
-          <w:lang w:val="nl-BE"/>
-        </w:rPr>
-      </w:pPr>
       <w:r>
         <w:rPr>
           <w:rFonts w:ascii="Segoe UI Symbol" w:hAnsi="Segoe UI Symbol"/>
           <w:color w:val="000000"/>
           <w:sz w:val="24"/>
-          <w:lang w:val="nl-BE"/>
         </w:rPr>
         <w:t>☐</w:t>
       </w:r>
@@ -728,39 +438,26 @@
         <w:rPr>
           <w:color w:val="000000"/>
           <w:sz w:val="24"/>
-          <w:lang w:val="nl-BE"/>
         </w:rPr>
         <w:t xml:space="preserve"> Ernstig </w:t>
       </w:r>
     </w:p>
     <w:p>
-      <w:pPr>
-        <w:rPr>
-          <w:lang w:val="nl-BE"/>
-        </w:rPr>
-      </w:pPr>
       <w:r>
         <w:rPr>
           <w:b/>
           <w:color w:val="000000"/>
           <w:sz w:val="24"/>
-          <w:lang w:val="nl-BE"/>
         </w:rPr>
         <w:t>Causaliteit t.o.v. de PARADISE-interventie (CMFO, drukmeting, MoveMonitor, Orthotimer, SEBIA-educatie):</w:t>
       </w:r>
     </w:p>
     <w:p>
-      <w:pPr>
-        <w:rPr>
-          <w:lang w:val="nl-BE"/>
-        </w:rPr>
-      </w:pPr>
       <w:r>
         <w:rPr>
           <w:rFonts w:ascii="Segoe UI Symbol" w:hAnsi="Segoe UI Symbol"/>
           <w:color w:val="000000"/>
           <w:sz w:val="24"/>
-          <w:lang w:val="nl-BE"/>
         </w:rPr>
         <w:t>☐</w:t>
       </w:r>
@@ -768,23 +465,16 @@
         <w:rPr>
           <w:color w:val="000000"/>
           <w:sz w:val="24"/>
-          <w:lang w:val="nl-BE"/>
         </w:rPr>
         <w:t xml:space="preserve"> Niet gerelateerd </w:t>
       </w:r>
     </w:p>
     <w:p>
-      <w:pPr>
-        <w:rPr>
-          <w:lang w:val="nl-BE"/>
-        </w:rPr>
-      </w:pPr>
       <w:r>
         <w:rPr>
           <w:rFonts w:ascii="Segoe UI Symbol" w:hAnsi="Segoe UI Symbol"/>
           <w:color w:val="000000"/>
           <w:sz w:val="24"/>
-          <w:lang w:val="nl-BE"/>
         </w:rPr>
         <w:t>☐</w:t>
       </w:r>
@@ -792,23 +482,16 @@
         <w:rPr>
           <w:color w:val="000000"/>
           <w:sz w:val="24"/>
-          <w:lang w:val="nl-BE"/>
         </w:rPr>
         <w:t xml:space="preserve"> Onwaarschijnlijk gerelateerd </w:t>
       </w:r>
     </w:p>
     <w:p>
-      <w:pPr>
-        <w:rPr>
-          <w:lang w:val="nl-BE"/>
-        </w:rPr>
-      </w:pPr>
       <w:r>
         <w:rPr>
           <w:rFonts w:ascii="Segoe UI Symbol" w:hAnsi="Segoe UI Symbol"/>
           <w:color w:val="000000"/>
           <w:sz w:val="24"/>
-          <w:lang w:val="nl-BE"/>
         </w:rPr>
         <w:t>☐</w:t>
       </w:r>
@@ -816,23 +499,16 @@
         <w:rPr>
           <w:color w:val="000000"/>
           <w:sz w:val="24"/>
-          <w:lang w:val="nl-BE"/>
         </w:rPr>
         <w:t xml:space="preserve"> Mogelijk gerelateerd </w:t>
       </w:r>
     </w:p>
     <w:p>
-      <w:pPr>
-        <w:rPr>
-          <w:lang w:val="nl-BE"/>
-        </w:rPr>
-      </w:pPr>
       <w:r>
         <w:rPr>
           <w:rFonts w:ascii="Segoe UI Symbol" w:hAnsi="Segoe UI Symbol"/>
           <w:color w:val="000000"/>
           <w:sz w:val="24"/>
-          <w:lang w:val="nl-BE"/>
         </w:rPr>
         <w:t>☐</w:t>
       </w:r>
@@ -840,25 +516,16 @@
         <w:rPr>
           <w:color w:val="000000"/>
           <w:sz w:val="24"/>
-          <w:lang w:val="nl-BE"/>
         </w:rPr>
         <w:t xml:space="preserve"> Waarschijnlijk gerelateerd </w:t>
       </w:r>
     </w:p>
     <w:p>
-      <w:pPr>
-        <w:rPr>
-          <w:color w:val="000000"/>
-          <w:sz w:val="24"/>
-          <w:lang w:val="nl-BE"/>
-        </w:rPr>
-      </w:pPr>
       <w:r>
         <w:rPr>
           <w:rFonts w:ascii="Segoe UI Symbol" w:hAnsi="Segoe UI Symbol"/>
           <w:color w:val="000000"/>
           <w:sz w:val="24"/>
-          <w:lang w:val="nl-BE"/>
         </w:rPr>
         <w:t>☐</w:t>
       </w:r>
@@ -866,65 +533,26 @@
         <w:rPr>
           <w:color w:val="000000"/>
           <w:sz w:val="24"/>
-          <w:lang w:val="nl-BE"/>
         </w:rPr>
         <w:t xml:space="preserve"> Zeker gerelateerd </w:t>
       </w:r>
     </w:p>
     <w:p>
-      <w:pPr>
-        <w:rPr>
-          <w:color w:val="000000"/>
-          <w:sz w:val="24"/>
-          <w:lang w:val="nl-BE"/>
-        </w:rPr>
-      </w:pPr>
-    </w:p>
-    <w:p>
-      <w:pPr>
-        <w:rPr>
-          <w:color w:val="000000"/>
-          <w:sz w:val="24"/>
-          <w:lang w:val="nl-BE"/>
-        </w:rPr>
-      </w:pPr>
-    </w:p>
-    <w:p>
-      <w:pPr>
-        <w:rPr>
-          <w:lang w:val="nl-BE"/>
-        </w:rPr>
-      </w:pPr>
-    </w:p>
-    <w:p>
-      <w:pPr>
-        <w:rPr>
-          <w:lang w:val="nl-BE"/>
-        </w:rPr>
-      </w:pPr>
       <w:r>
         <w:rPr>
           <w:b/>
           <w:color w:val="000000"/>
           <w:sz w:val="24"/>
-          <w:lang w:val="nl-BE"/>
-        </w:rPr>
-        <w:lastRenderedPageBreak/>
+        </w:rPr>
         <w:t>Verwacht op basis van het risicoprofiel van de patiënt/interventie?</w:t>
       </w:r>
     </w:p>
     <w:p>
-      <w:pPr>
-        <w:rPr>
-          <w:lang w:val="nl-BE"/>
-        </w:rPr>
-      </w:pPr>
       <w:r>
         <w:rPr>
           <w:rFonts w:ascii="Segoe UI Symbol" w:hAnsi="Segoe UI Symbol"/>
           <w:color w:val="000000"/>
           <w:sz w:val="24"/>
-          <w:lang w:val="nl-BE"/>
         </w:rPr>
         <w:t>☐</w:t>
       </w:r>
@@ -932,23 +560,16 @@
         <w:rPr>
           <w:color w:val="000000"/>
           <w:sz w:val="24"/>
-          <w:lang w:val="nl-BE"/>
         </w:rPr>
         <w:t xml:space="preserve"> Verwacht </w:t>
       </w:r>
     </w:p>
     <w:p>
-      <w:pPr>
-        <w:rPr>
-          <w:lang w:val="nl-BE"/>
-        </w:rPr>
-      </w:pPr>
       <w:r>
         <w:rPr>
           <w:rFonts w:ascii="Segoe UI Symbol" w:hAnsi="Segoe UI Symbol"/>
           <w:color w:val="000000"/>
           <w:sz w:val="24"/>
-          <w:lang w:val="nl-BE"/>
         </w:rPr>
         <w:t>☐</w:t>
       </w:r>
@@ -956,39 +577,26 @@
         <w:rPr>
           <w:color w:val="000000"/>
           <w:sz w:val="24"/>
-          <w:lang w:val="nl-BE"/>
         </w:rPr>
         <w:t xml:space="preserve"> Onverwacht </w:t>
       </w:r>
     </w:p>
     <w:p>
-      <w:pPr>
-        <w:rPr>
-          <w:lang w:val="nl-BE"/>
-        </w:rPr>
-      </w:pPr>
       <w:r>
         <w:rPr>
           <w:b/>
           <w:color w:val="000000"/>
           <w:sz w:val="24"/>
-          <w:lang w:val="nl-BE"/>
         </w:rPr>
         <w:t>Actie ondernomen t.a.v. de interventie:</w:t>
       </w:r>
     </w:p>
     <w:p>
-      <w:pPr>
-        <w:rPr>
-          <w:lang w:val="nl-BE"/>
-        </w:rPr>
-      </w:pPr>
       <w:r>
         <w:rPr>
           <w:rFonts w:ascii="Segoe UI Symbol" w:hAnsi="Segoe UI Symbol"/>
           <w:color w:val="000000"/>
           <w:sz w:val="24"/>
-          <w:lang w:val="nl-BE"/>
         </w:rPr>
         <w:t>☐</w:t>
       </w:r>
@@ -996,23 +604,16 @@
         <w:rPr>
           <w:color w:val="000000"/>
           <w:sz w:val="24"/>
-          <w:lang w:val="nl-BE"/>
         </w:rPr>
         <w:t xml:space="preserve"> Geen wijziging </w:t>
       </w:r>
     </w:p>
     <w:p>
-      <w:pPr>
-        <w:rPr>
-          <w:lang w:val="nl-BE"/>
-        </w:rPr>
-      </w:pPr>
       <w:r>
         <w:rPr>
           <w:rFonts w:ascii="Segoe UI Symbol" w:hAnsi="Segoe UI Symbol"/>
           <w:color w:val="000000"/>
           <w:sz w:val="24"/>
-          <w:lang w:val="nl-BE"/>
         </w:rPr>
         <w:t>☐</w:t>
       </w:r>
@@ -1020,23 +621,16 @@
         <w:rPr>
           <w:color w:val="000000"/>
           <w:sz w:val="24"/>
-          <w:lang w:val="nl-BE"/>
         </w:rPr>
         <w:t xml:space="preserve"> Tijdelijk onderbroken </w:t>
       </w:r>
     </w:p>
     <w:p>
-      <w:pPr>
-        <w:rPr>
-          <w:lang w:val="nl-BE"/>
-        </w:rPr>
-      </w:pPr>
       <w:r>
         <w:rPr>
           <w:rFonts w:ascii="Segoe UI Symbol" w:hAnsi="Segoe UI Symbol"/>
           <w:color w:val="000000"/>
           <w:sz w:val="24"/>
-          <w:lang w:val="nl-BE"/>
         </w:rPr>
         <w:t>☐</w:t>
       </w:r>
@@ -1044,23 +638,16 @@
         <w:rPr>
           <w:color w:val="000000"/>
           <w:sz w:val="24"/>
-          <w:lang w:val="nl-BE"/>
         </w:rPr>
         <w:t xml:space="preserve"> Aangepast </w:t>
       </w:r>
     </w:p>
     <w:p>
-      <w:pPr>
-        <w:rPr>
-          <w:lang w:val="nl-BE"/>
-        </w:rPr>
-      </w:pPr>
       <w:r>
         <w:rPr>
           <w:rFonts w:ascii="Segoe UI Symbol" w:hAnsi="Segoe UI Symbol"/>
           <w:color w:val="000000"/>
           <w:sz w:val="24"/>
-          <w:lang w:val="nl-BE"/>
         </w:rPr>
         <w:t>☐</w:t>
       </w:r>
@@ -1068,54 +655,35 @@
         <w:rPr>
           <w:color w:val="000000"/>
           <w:sz w:val="24"/>
-          <w:lang w:val="nl-BE"/>
         </w:rPr>
         <w:t xml:space="preserve"> Definitief gestopt </w:t>
       </w:r>
     </w:p>
     <w:p>
-      <w:pPr>
-        <w:rPr>
-          <w:lang w:val="nl-BE"/>
-        </w:rPr>
-      </w:pPr>
-      <w:r>
-        <w:rPr>
-          <w:color w:val="000000"/>
-          <w:sz w:val="24"/>
-          <w:lang w:val="nl-BE"/>
+      <w:r>
+        <w:rPr>
+          <w:color w:val="000000"/>
+          <w:sz w:val="24"/>
         </w:rPr>
         <w:t xml:space="preserve">Toelichting bij de actie: __________________________________________________ </w:t>
       </w:r>
     </w:p>
     <w:p>
-      <w:pPr>
-        <w:rPr>
-          <w:lang w:val="nl-BE"/>
-        </w:rPr>
-      </w:pPr>
       <w:r>
         <w:rPr>
           <w:b/>
           <w:color w:val="000000"/>
           <w:sz w:val="24"/>
-          <w:lang w:val="nl-BE"/>
         </w:rPr>
         <w:t>Uitkomst:</w:t>
       </w:r>
     </w:p>
     <w:p>
-      <w:pPr>
-        <w:rPr>
-          <w:lang w:val="nl-BE"/>
-        </w:rPr>
-      </w:pPr>
       <w:r>
         <w:rPr>
           <w:rFonts w:ascii="Segoe UI Symbol" w:hAnsi="Segoe UI Symbol"/>
           <w:color w:val="000000"/>
           <w:sz w:val="24"/>
-          <w:lang w:val="nl-BE"/>
         </w:rPr>
         <w:t>☐</w:t>
       </w:r>
@@ -1123,23 +691,16 @@
         <w:rPr>
           <w:color w:val="000000"/>
           <w:sz w:val="24"/>
-          <w:lang w:val="nl-BE"/>
         </w:rPr>
         <w:t xml:space="preserve"> Hersteld/opgelost </w:t>
       </w:r>
     </w:p>
     <w:p>
-      <w:pPr>
-        <w:rPr>
-          <w:lang w:val="nl-BE"/>
-        </w:rPr>
-      </w:pPr>
       <w:r>
         <w:rPr>
           <w:rFonts w:ascii="Segoe UI Symbol" w:hAnsi="Segoe UI Symbol"/>
           <w:color w:val="000000"/>
           <w:sz w:val="24"/>
-          <w:lang w:val="nl-BE"/>
         </w:rPr>
         <w:t>☐</w:t>
       </w:r>
@@ -1147,23 +708,16 @@
         <w:rPr>
           <w:color w:val="000000"/>
           <w:sz w:val="24"/>
-          <w:lang w:val="nl-BE"/>
         </w:rPr>
         <w:t xml:space="preserve"> Hersteld met restletsel </w:t>
       </w:r>
     </w:p>
     <w:p>
-      <w:pPr>
-        <w:rPr>
-          <w:lang w:val="nl-BE"/>
-        </w:rPr>
-      </w:pPr>
       <w:r>
         <w:rPr>
           <w:rFonts w:ascii="Segoe UI Symbol" w:hAnsi="Segoe UI Symbol"/>
           <w:color w:val="000000"/>
           <w:sz w:val="24"/>
-          <w:lang w:val="nl-BE"/>
         </w:rPr>
         <w:t>☐</w:t>
       </w:r>
@@ -1171,23 +725,16 @@
         <w:rPr>
           <w:color w:val="000000"/>
           <w:sz w:val="24"/>
-          <w:lang w:val="nl-BE"/>
         </w:rPr>
         <w:t xml:space="preserve"> Nog niet hersteld </w:t>
       </w:r>
     </w:p>
     <w:p>
-      <w:pPr>
-        <w:rPr>
-          <w:lang w:val="nl-BE"/>
-        </w:rPr>
-      </w:pPr>
       <w:r>
         <w:rPr>
           <w:rFonts w:ascii="Segoe UI Symbol" w:hAnsi="Segoe UI Symbol"/>
           <w:color w:val="000000"/>
           <w:sz w:val="24"/>
-          <w:lang w:val="nl-BE"/>
         </w:rPr>
         <w:t>☐</w:t>
       </w:r>
@@ -1195,25 +742,16 @@
         <w:rPr>
           <w:color w:val="000000"/>
           <w:sz w:val="24"/>
-          <w:lang w:val="nl-BE"/>
         </w:rPr>
         <w:t xml:space="preserve"> Overleden </w:t>
       </w:r>
     </w:p>
     <w:p>
-      <w:pPr>
-        <w:rPr>
-          <w:color w:val="000000"/>
-          <w:sz w:val="24"/>
-          <w:lang w:val="nl-BE"/>
-        </w:rPr>
-      </w:pPr>
       <w:r>
         <w:rPr>
           <w:rFonts w:ascii="Segoe UI Symbol" w:hAnsi="Segoe UI Symbol"/>
           <w:color w:val="000000"/>
           <w:sz w:val="24"/>
-          <w:lang w:val="nl-BE"/>
         </w:rPr>
         <w:t>☐</w:t>
       </w:r>
@@ -1221,169 +759,43 @@
         <w:rPr>
           <w:color w:val="000000"/>
           <w:sz w:val="24"/>
-          <w:lang w:val="nl-BE"/>
         </w:rPr>
         <w:t xml:space="preserve"> Onbekend </w:t>
       </w:r>
     </w:p>
     <w:p>
       <w:pPr>
-        <w:rPr>
-          <w:color w:val="000000"/>
-          <w:sz w:val="24"/>
-          <w:lang w:val="nl-BE"/>
-        </w:rPr>
-      </w:pPr>
-    </w:p>
-    <w:p>
-      <w:pPr>
-        <w:rPr>
-          <w:color w:val="000000"/>
-          <w:sz w:val="24"/>
-          <w:lang w:val="nl-BE"/>
-        </w:rPr>
-      </w:pPr>
-    </w:p>
-    <w:p>
-      <w:pPr>
-        <w:rPr>
-          <w:color w:val="000000"/>
-          <w:sz w:val="24"/>
-          <w:lang w:val="nl-BE"/>
-        </w:rPr>
-      </w:pPr>
-    </w:p>
-    <w:p>
-      <w:pPr>
-        <w:rPr>
-          <w:color w:val="000000"/>
-          <w:sz w:val="24"/>
-          <w:lang w:val="nl-BE"/>
-        </w:rPr>
-      </w:pPr>
-    </w:p>
-    <w:p>
-      <w:pPr>
-        <w:rPr>
-          <w:color w:val="000000"/>
-          <w:sz w:val="24"/>
-          <w:lang w:val="nl-BE"/>
-        </w:rPr>
-      </w:pPr>
-    </w:p>
-    <w:p>
-      <w:pPr>
-        <w:rPr>
-          <w:color w:val="000000"/>
-          <w:sz w:val="24"/>
-          <w:lang w:val="nl-BE"/>
-        </w:rPr>
-      </w:pPr>
-    </w:p>
-    <w:p>
-      <w:pPr>
-        <w:rPr>
-          <w:color w:val="000000"/>
-          <w:sz w:val="24"/>
-          <w:lang w:val="nl-BE"/>
-        </w:rPr>
-      </w:pPr>
-    </w:p>
-    <w:p>
-      <w:pPr>
-        <w:rPr>
-          <w:color w:val="000000"/>
-          <w:sz w:val="24"/>
-          <w:lang w:val="nl-BE"/>
-        </w:rPr>
-      </w:pPr>
-    </w:p>
-    <w:p>
-      <w:pPr>
-        <w:rPr>
-          <w:color w:val="000000"/>
-          <w:sz w:val="24"/>
-          <w:lang w:val="nl-BE"/>
-        </w:rPr>
-      </w:pPr>
-    </w:p>
-    <w:p>
-      <w:pPr>
-        <w:rPr>
-          <w:color w:val="000000"/>
-          <w:sz w:val="24"/>
-          <w:lang w:val="nl-BE"/>
-        </w:rPr>
-      </w:pPr>
-    </w:p>
-    <w:p>
-      <w:pPr>
-        <w:rPr>
-          <w:color w:val="000000"/>
-          <w:sz w:val="24"/>
-          <w:lang w:val="nl-BE"/>
-        </w:rPr>
-      </w:pPr>
-    </w:p>
-    <w:p>
-      <w:pPr>
-        <w:rPr>
-          <w:lang w:val="nl-BE"/>
-        </w:rPr>
-      </w:pPr>
-    </w:p>
-    <w:p>
-      <w:pPr>
         <w:pStyle w:val="Stijl3"/>
       </w:pPr>
       <w:r>
-        <w:lastRenderedPageBreak/>
         <w:t>3. Amputatie (indien van toepassing)</w:t>
       </w:r>
     </w:p>
     <w:p>
-      <w:pPr>
-        <w:rPr>
-          <w:lang w:val="nl-BE"/>
-        </w:rPr>
-      </w:pPr>
-      <w:r>
-        <w:rPr>
-          <w:color w:val="000000"/>
-          <w:sz w:val="24"/>
-          <w:lang w:val="nl-BE"/>
+      <w:r>
+        <w:rPr>
+          <w:color w:val="000000"/>
+          <w:sz w:val="24"/>
         </w:rPr>
         <w:t>In te vullen wanneer het event een amputatie betreft. Dit ondersteunt de secundaire eindpunten ‘majeure amputatie’ en ‘mineure amputatie’ conform de internationale Core Outcome Set.</w:t>
       </w:r>
     </w:p>
     <w:p>
-      <w:pPr>
-        <w:rPr>
-          <w:lang w:val="nl-BE"/>
-        </w:rPr>
-      </w:pPr>
       <w:r>
         <w:rPr>
           <w:b/>
           <w:color w:val="000000"/>
           <w:sz w:val="24"/>
-          <w:lang w:val="nl-BE"/>
         </w:rPr>
         <w:t>Amputatie opgetreden?</w:t>
       </w:r>
     </w:p>
     <w:p>
-      <w:pPr>
-        <w:rPr>
-          <w:lang w:val="nl-BE"/>
-        </w:rPr>
-      </w:pPr>
       <w:r>
         <w:rPr>
           <w:rFonts w:ascii="Segoe UI Symbol" w:hAnsi="Segoe UI Symbol"/>
           <w:color w:val="000000"/>
           <w:sz w:val="24"/>
-          <w:lang w:val="nl-BE"/>
         </w:rPr>
         <w:t>☐</w:t>
       </w:r>
@@ -1391,23 +803,16 @@
         <w:rPr>
           <w:color w:val="000000"/>
           <w:sz w:val="24"/>
-          <w:lang w:val="nl-BE"/>
         </w:rPr>
         <w:t xml:space="preserve"> Ja </w:t>
       </w:r>
     </w:p>
     <w:p>
-      <w:pPr>
-        <w:rPr>
-          <w:lang w:val="nl-BE"/>
-        </w:rPr>
-      </w:pPr>
       <w:r>
         <w:rPr>
           <w:rFonts w:ascii="Segoe UI Symbol" w:hAnsi="Segoe UI Symbol"/>
           <w:color w:val="000000"/>
           <w:sz w:val="24"/>
-          <w:lang w:val="nl-BE"/>
         </w:rPr>
         <w:t>☐</w:t>
       </w:r>
@@ -1415,39 +820,26 @@
         <w:rPr>
           <w:color w:val="000000"/>
           <w:sz w:val="24"/>
-          <w:lang w:val="nl-BE"/>
         </w:rPr>
         <w:t xml:space="preserve"> Nee </w:t>
       </w:r>
     </w:p>
     <w:p>
-      <w:pPr>
-        <w:rPr>
-          <w:lang w:val="nl-BE"/>
-        </w:rPr>
-      </w:pPr>
       <w:r>
         <w:rPr>
           <w:b/>
           <w:color w:val="000000"/>
           <w:sz w:val="24"/>
-          <w:lang w:val="nl-BE"/>
         </w:rPr>
         <w:t>Niveau:</w:t>
       </w:r>
     </w:p>
     <w:p>
-      <w:pPr>
-        <w:rPr>
-          <w:lang w:val="nl-BE"/>
-        </w:rPr>
-      </w:pPr>
       <w:r>
         <w:rPr>
           <w:rFonts w:ascii="Segoe UI Symbol" w:hAnsi="Segoe UI Symbol"/>
           <w:color w:val="000000"/>
           <w:sz w:val="24"/>
-          <w:lang w:val="nl-BE"/>
         </w:rPr>
         <w:t>☐</w:t>
       </w:r>
@@ -1455,23 +847,16 @@
         <w:rPr>
           <w:color w:val="000000"/>
           <w:sz w:val="24"/>
-          <w:lang w:val="nl-BE"/>
         </w:rPr>
         <w:t xml:space="preserve"> Majeure amputatie (boven enkelniveau) </w:t>
       </w:r>
     </w:p>
     <w:p>
-      <w:pPr>
-        <w:rPr>
-          <w:lang w:val="nl-BE"/>
-        </w:rPr>
-      </w:pPr>
       <w:r>
         <w:rPr>
           <w:rFonts w:ascii="Segoe UI Symbol" w:hAnsi="Segoe UI Symbol"/>
           <w:color w:val="000000"/>
           <w:sz w:val="24"/>
-          <w:lang w:val="nl-BE"/>
         </w:rPr>
         <w:t>☐</w:t>
       </w:r>
@@ -1479,54 +864,35 @@
         <w:rPr>
           <w:color w:val="000000"/>
           <w:sz w:val="24"/>
-          <w:lang w:val="nl-BE"/>
         </w:rPr>
         <w:t xml:space="preserve"> Mineure amputatie (onder enkelniveau, bv. teen/voorvoet) </w:t>
       </w:r>
     </w:p>
     <w:p>
-      <w:pPr>
-        <w:rPr>
-          <w:lang w:val="nl-BE"/>
-        </w:rPr>
-      </w:pPr>
-      <w:r>
-        <w:rPr>
-          <w:color w:val="000000"/>
-          <w:sz w:val="24"/>
-          <w:lang w:val="nl-BE"/>
+      <w:r>
+        <w:rPr>
+          <w:color w:val="000000"/>
+          <w:sz w:val="24"/>
         </w:rPr>
         <w:t xml:space="preserve">Datum amputatie: ____ / ____ / ______ </w:t>
       </w:r>
     </w:p>
     <w:p>
-      <w:pPr>
-        <w:rPr>
-          <w:lang w:val="nl-BE"/>
-        </w:rPr>
-      </w:pPr>
       <w:r>
         <w:rPr>
           <w:b/>
           <w:color w:val="000000"/>
           <w:sz w:val="24"/>
-          <w:lang w:val="nl-BE"/>
         </w:rPr>
         <w:t>Zijde:</w:t>
       </w:r>
     </w:p>
     <w:p>
-      <w:pPr>
-        <w:rPr>
-          <w:lang w:val="nl-BE"/>
-        </w:rPr>
-      </w:pPr>
       <w:r>
         <w:rPr>
           <w:rFonts w:ascii="Segoe UI Symbol" w:hAnsi="Segoe UI Symbol"/>
           <w:color w:val="000000"/>
           <w:sz w:val="24"/>
-          <w:lang w:val="nl-BE"/>
         </w:rPr>
         <w:t>☐</w:t>
       </w:r>
@@ -1534,23 +900,16 @@
         <w:rPr>
           <w:color w:val="000000"/>
           <w:sz w:val="24"/>
-          <w:lang w:val="nl-BE"/>
         </w:rPr>
         <w:t xml:space="preserve"> Links </w:t>
       </w:r>
     </w:p>
     <w:p>
-      <w:pPr>
-        <w:rPr>
-          <w:lang w:val="nl-BE"/>
-        </w:rPr>
-      </w:pPr>
       <w:r>
         <w:rPr>
           <w:rFonts w:ascii="Segoe UI Symbol" w:hAnsi="Segoe UI Symbol"/>
           <w:color w:val="000000"/>
           <w:sz w:val="24"/>
-          <w:lang w:val="nl-BE"/>
         </w:rPr>
         <w:t>☐</w:t>
       </w:r>
@@ -1558,234 +917,70 @@
         <w:rPr>
           <w:color w:val="000000"/>
           <w:sz w:val="24"/>
-          <w:lang w:val="nl-BE"/>
         </w:rPr>
         <w:t xml:space="preserve"> Rechts </w:t>
       </w:r>
     </w:p>
     <w:p>
-      <w:pPr>
-        <w:rPr>
-          <w:color w:val="000000"/>
-          <w:sz w:val="24"/>
-          <w:lang w:val="nl-BE"/>
-        </w:rPr>
-      </w:pPr>
-      <w:r>
-        <w:rPr>
-          <w:color w:val="000000"/>
-          <w:sz w:val="24"/>
-          <w:lang w:val="nl-BE"/>
+      <w:r>
+        <w:rPr>
+          <w:color w:val="000000"/>
+          <w:sz w:val="24"/>
         </w:rPr>
         <w:t xml:space="preserve">Reden/indicatie: _________________________________________________________ </w:t>
       </w:r>
     </w:p>
     <w:p>
       <w:pPr>
-        <w:rPr>
-          <w:color w:val="000000"/>
-          <w:sz w:val="24"/>
-          <w:lang w:val="nl-BE"/>
-        </w:rPr>
-      </w:pPr>
-    </w:p>
-    <w:p>
-      <w:pPr>
-        <w:rPr>
-          <w:color w:val="000000"/>
-          <w:sz w:val="24"/>
-          <w:lang w:val="nl-BE"/>
-        </w:rPr>
-      </w:pPr>
-    </w:p>
-    <w:p>
-      <w:pPr>
-        <w:rPr>
-          <w:color w:val="000000"/>
-          <w:sz w:val="24"/>
-          <w:lang w:val="nl-BE"/>
-        </w:rPr>
-      </w:pPr>
-    </w:p>
-    <w:p>
-      <w:pPr>
-        <w:rPr>
-          <w:color w:val="000000"/>
-          <w:sz w:val="24"/>
-          <w:lang w:val="nl-BE"/>
-        </w:rPr>
-      </w:pPr>
-    </w:p>
-    <w:p>
-      <w:pPr>
-        <w:rPr>
-          <w:color w:val="000000"/>
-          <w:sz w:val="24"/>
-          <w:lang w:val="nl-BE"/>
-        </w:rPr>
-      </w:pPr>
-    </w:p>
-    <w:p>
-      <w:pPr>
-        <w:rPr>
-          <w:color w:val="000000"/>
-          <w:sz w:val="24"/>
-          <w:lang w:val="nl-BE"/>
-        </w:rPr>
-      </w:pPr>
-    </w:p>
-    <w:p>
-      <w:pPr>
-        <w:rPr>
-          <w:color w:val="000000"/>
-          <w:sz w:val="24"/>
-          <w:lang w:val="nl-BE"/>
-        </w:rPr>
-      </w:pPr>
-    </w:p>
-    <w:p>
-      <w:pPr>
-        <w:rPr>
-          <w:color w:val="000000"/>
-          <w:sz w:val="24"/>
-          <w:lang w:val="nl-BE"/>
-        </w:rPr>
-      </w:pPr>
-    </w:p>
-    <w:p>
-      <w:pPr>
-        <w:rPr>
-          <w:color w:val="000000"/>
-          <w:sz w:val="24"/>
-          <w:lang w:val="nl-BE"/>
-        </w:rPr>
-      </w:pPr>
-    </w:p>
-    <w:p>
-      <w:pPr>
-        <w:rPr>
-          <w:color w:val="000000"/>
-          <w:sz w:val="24"/>
-          <w:lang w:val="nl-BE"/>
-        </w:rPr>
-      </w:pPr>
-    </w:p>
-    <w:p>
-      <w:pPr>
-        <w:rPr>
-          <w:color w:val="000000"/>
-          <w:sz w:val="24"/>
-          <w:lang w:val="nl-BE"/>
-        </w:rPr>
-      </w:pPr>
-    </w:p>
-    <w:p>
-      <w:pPr>
-        <w:rPr>
-          <w:color w:val="000000"/>
-          <w:sz w:val="24"/>
-          <w:lang w:val="nl-BE"/>
-        </w:rPr>
-      </w:pPr>
-    </w:p>
-    <w:p>
-      <w:pPr>
-        <w:rPr>
-          <w:color w:val="000000"/>
-          <w:sz w:val="24"/>
-          <w:lang w:val="nl-BE"/>
-        </w:rPr>
-      </w:pPr>
-    </w:p>
-    <w:p>
-      <w:pPr>
-        <w:rPr>
-          <w:lang w:val="nl-BE"/>
-        </w:rPr>
-      </w:pPr>
-    </w:p>
-    <w:p>
-      <w:pPr>
         <w:pStyle w:val="Stijl3"/>
       </w:pPr>
       <w:r>
-        <w:lastRenderedPageBreak/>
         <w:t>4. Overlijden (indien van toepassing)</w:t>
       </w:r>
     </w:p>
     <w:p>
-      <w:pPr>
-        <w:rPr>
-          <w:lang w:val="nl-BE"/>
-        </w:rPr>
-      </w:pPr>
-      <w:r>
-        <w:rPr>
-          <w:color w:val="000000"/>
-          <w:sz w:val="24"/>
-          <w:lang w:val="nl-BE"/>
+      <w:r>
+        <w:rPr>
+          <w:color w:val="000000"/>
+          <w:sz w:val="24"/>
         </w:rPr>
         <w:t>In te vullen wanneer het event het overlijden van de deelnemer betreft. Dit ondersteunt het secundaire eindpunt ‘mortaliteit’ conform de internationale Core Outcome Set.</w:t>
       </w:r>
     </w:p>
     <w:p>
-      <w:pPr>
-        <w:rPr>
-          <w:lang w:val="nl-BE"/>
-        </w:rPr>
-      </w:pPr>
-      <w:r>
-        <w:rPr>
-          <w:color w:val="000000"/>
-          <w:sz w:val="24"/>
-          <w:lang w:val="nl-BE"/>
+      <w:r>
+        <w:rPr>
+          <w:color w:val="000000"/>
+          <w:sz w:val="24"/>
         </w:rPr>
         <w:t xml:space="preserve">Datum overlijden: ____ / ____ / ______ </w:t>
       </w:r>
     </w:p>
     <w:p>
-      <w:pPr>
-        <w:rPr>
-          <w:lang w:val="nl-BE"/>
-        </w:rPr>
-      </w:pPr>
-      <w:r>
-        <w:rPr>
-          <w:color w:val="000000"/>
-          <w:sz w:val="24"/>
-          <w:lang w:val="nl-BE"/>
+      <w:r>
+        <w:rPr>
+          <w:color w:val="000000"/>
+          <w:sz w:val="24"/>
         </w:rPr>
         <w:t xml:space="preserve">Vermoedelijke doodsoorzaak: ______________________________________________ </w:t>
       </w:r>
     </w:p>
     <w:p>
-      <w:pPr>
-        <w:rPr>
-          <w:lang w:val="nl-BE"/>
-        </w:rPr>
-      </w:pPr>
       <w:r>
         <w:rPr>
           <w:b/>
           <w:color w:val="000000"/>
           <w:sz w:val="24"/>
-          <w:lang w:val="nl-BE"/>
         </w:rPr>
         <w:t>Gerelateerd aan de PARADISE-interventie?</w:t>
       </w:r>
     </w:p>
     <w:p>
-      <w:pPr>
-        <w:rPr>
-          <w:lang w:val="nl-BE"/>
-        </w:rPr>
-      </w:pPr>
       <w:r>
         <w:rPr>
           <w:rFonts w:ascii="Segoe UI Symbol" w:hAnsi="Segoe UI Symbol"/>
           <w:color w:val="000000"/>
           <w:sz w:val="24"/>
-          <w:lang w:val="nl-BE"/>
         </w:rPr>
         <w:t>☐</w:t>
       </w:r>
@@ -1793,23 +988,16 @@
         <w:rPr>
           <w:color w:val="000000"/>
           <w:sz w:val="24"/>
-          <w:lang w:val="nl-BE"/>
         </w:rPr>
         <w:t xml:space="preserve"> Ja </w:t>
       </w:r>
     </w:p>
     <w:p>
-      <w:pPr>
-        <w:rPr>
-          <w:lang w:val="nl-BE"/>
-        </w:rPr>
-      </w:pPr>
       <w:r>
         <w:rPr>
           <w:rFonts w:ascii="Segoe UI Symbol" w:hAnsi="Segoe UI Symbol"/>
           <w:color w:val="000000"/>
           <w:sz w:val="24"/>
-          <w:lang w:val="nl-BE"/>
         </w:rPr>
         <w:t>☐</w:t>
       </w:r>
@@ -1817,23 +1005,16 @@
         <w:rPr>
           <w:color w:val="000000"/>
           <w:sz w:val="24"/>
-          <w:lang w:val="nl-BE"/>
         </w:rPr>
         <w:t xml:space="preserve"> Nee </w:t>
       </w:r>
     </w:p>
     <w:p>
-      <w:pPr>
-        <w:rPr>
-          <w:lang w:val="nl-BE"/>
-        </w:rPr>
-      </w:pPr>
       <w:r>
         <w:rPr>
           <w:rFonts w:ascii="Segoe UI Symbol" w:hAnsi="Segoe UI Symbol"/>
           <w:color w:val="000000"/>
           <w:sz w:val="24"/>
-          <w:lang w:val="nl-BE"/>
         </w:rPr>
         <w:t>☐</w:t>
       </w:r>
@@ -1841,39 +1022,26 @@
         <w:rPr>
           <w:color w:val="000000"/>
           <w:sz w:val="24"/>
-          <w:lang w:val="nl-BE"/>
         </w:rPr>
         <w:t xml:space="preserve"> Onbekend </w:t>
       </w:r>
     </w:p>
     <w:p>
-      <w:pPr>
-        <w:rPr>
-          <w:lang w:val="nl-BE"/>
-        </w:rPr>
-      </w:pPr>
       <w:r>
         <w:rPr>
           <w:b/>
           <w:color w:val="000000"/>
           <w:sz w:val="24"/>
-          <w:lang w:val="nl-BE"/>
         </w:rPr>
         <w:t>Autopsie uitgevoerd?</w:t>
       </w:r>
     </w:p>
     <w:p>
-      <w:pPr>
-        <w:rPr>
-          <w:lang w:val="nl-BE"/>
-        </w:rPr>
-      </w:pPr>
       <w:r>
         <w:rPr>
           <w:rFonts w:ascii="Segoe UI Symbol" w:hAnsi="Segoe UI Symbol"/>
           <w:color w:val="000000"/>
           <w:sz w:val="24"/>
-          <w:lang w:val="nl-BE"/>
         </w:rPr>
         <w:t>☐</w:t>
       </w:r>
@@ -1881,23 +1049,16 @@
         <w:rPr>
           <w:color w:val="000000"/>
           <w:sz w:val="24"/>
-          <w:lang w:val="nl-BE"/>
         </w:rPr>
         <w:t xml:space="preserve"> Ja </w:t>
       </w:r>
     </w:p>
     <w:p>
-      <w:pPr>
-        <w:rPr>
-          <w:lang w:val="nl-BE"/>
-        </w:rPr>
-      </w:pPr>
       <w:r>
         <w:rPr>
           <w:rFonts w:ascii="Segoe UI Symbol" w:hAnsi="Segoe UI Symbol"/>
           <w:color w:val="000000"/>
           <w:sz w:val="24"/>
-          <w:lang w:val="nl-BE"/>
         </w:rPr>
         <w:t>☐</w:t>
       </w:r>
@@ -1905,23 +1066,16 @@
         <w:rPr>
           <w:color w:val="000000"/>
           <w:sz w:val="24"/>
-          <w:lang w:val="nl-BE"/>
         </w:rPr>
         <w:t xml:space="preserve"> Nee </w:t>
       </w:r>
     </w:p>
     <w:p>
-      <w:pPr>
-        <w:rPr>
-          <w:lang w:val="nl-BE"/>
-        </w:rPr>
-      </w:pPr>
       <w:r>
         <w:rPr>
           <w:rFonts w:ascii="Segoe UI Symbol" w:hAnsi="Segoe UI Symbol"/>
           <w:color w:val="000000"/>
           <w:sz w:val="24"/>
-          <w:lang w:val="nl-BE"/>
         </w:rPr>
         <w:t>☐</w:t>
       </w:r>
@@ -1929,7 +1083,6 @@
         <w:rPr>
           <w:color w:val="000000"/>
           <w:sz w:val="24"/>
-          <w:lang w:val="nl-BE"/>
         </w:rPr>
         <w:t xml:space="preserve"> Onbekend </w:t>
       </w:r>
@@ -1943,76 +1096,46 @@
       </w:r>
     </w:p>
     <w:p>
-      <w:pPr>
-        <w:rPr>
-          <w:lang w:val="nl-BE"/>
-        </w:rPr>
-      </w:pPr>
-      <w:r>
-        <w:rPr>
-          <w:color w:val="000000"/>
-          <w:sz w:val="24"/>
-          <w:lang w:val="nl-BE"/>
-        </w:rPr>
-        <w:t>Bij een SAE: melding aan de sponsor dient te gebeuren binnen 72 uur na kennisname door de onderzoeker.</w:t>
-      </w:r>
-    </w:p>
-    <w:p>
-      <w:pPr>
-        <w:rPr>
-          <w:lang w:val="nl-BE"/>
-        </w:rPr>
-      </w:pPr>
-      <w:r>
-        <w:rPr>
-          <w:color w:val="000000"/>
-          <w:sz w:val="24"/>
-          <w:lang w:val="nl-BE"/>
+      <w:r>
+        <w:rPr>
+          <w:color w:val="000000"/>
+          <w:sz w:val="24"/>
+        </w:rPr>
+        <w:t>Bij een SAE: melding aan de sponsor dient te gebeuren binnen 72 uur na kennisname door de onderzoeker (§6).</w:t>
+      </w:r>
+    </w:p>
+    <w:p>
+      <w:r>
+        <w:rPr>
+          <w:color w:val="000000"/>
+          <w:sz w:val="24"/>
         </w:rPr>
         <w:t xml:space="preserve">Datum melding aan PI: ____ / ____ / ______ </w:t>
       </w:r>
     </w:p>
     <w:p>
-      <w:pPr>
-        <w:rPr>
-          <w:lang w:val="nl-BE"/>
-        </w:rPr>
-      </w:pPr>
-      <w:r>
-        <w:rPr>
-          <w:color w:val="000000"/>
-          <w:sz w:val="24"/>
-          <w:lang w:val="nl-BE"/>
+      <w:r>
+        <w:rPr>
+          <w:color w:val="000000"/>
+          <w:sz w:val="24"/>
         </w:rPr>
         <w:t xml:space="preserve">Datum melding aan sponsor (indien SAE, ≤ 72u na kennisname): ____ / ____ / ______ </w:t>
       </w:r>
     </w:p>
     <w:p>
-      <w:pPr>
-        <w:rPr>
-          <w:lang w:val="nl-BE"/>
-        </w:rPr>
-      </w:pPr>
-      <w:r>
-        <w:rPr>
-          <w:color w:val="000000"/>
-          <w:sz w:val="24"/>
-          <w:lang w:val="nl-BE"/>
+      <w:r>
+        <w:rPr>
+          <w:color w:val="000000"/>
+          <w:sz w:val="24"/>
         </w:rPr>
         <w:t xml:space="preserve">Datum melding aan Ethische Commissie / FAGG (indien van toepassing): ____ / ____ / ______ </w:t>
       </w:r>
     </w:p>
     <w:p>
-      <w:pPr>
-        <w:rPr>
-          <w:lang w:val="nl-BE"/>
-        </w:rPr>
-      </w:pPr>
-      <w:r>
-        <w:rPr>
-          <w:color w:val="000000"/>
-          <w:sz w:val="24"/>
-          <w:lang w:val="nl-BE"/>
+      <w:r>
+        <w:rPr>
+          <w:color w:val="000000"/>
+          <w:sz w:val="24"/>
         </w:rPr>
         <w:t xml:space="preserve">Naam en functie van de beoordelaar: _______________________________________ </w:t>
       </w:r>
@@ -2030,12 +1153,12 @@
     <w:p/>
     <w:p/>
     <w:sectPr>
-      <w:headerReference w:type="even" r:id="rId10"/>
-      <w:headerReference w:type="default" r:id="rId11"/>
-      <w:footerReference w:type="even" r:id="rId12"/>
-      <w:footerReference w:type="default" r:id="rId13"/>
-      <w:headerReference w:type="first" r:id="rId14"/>
-      <w:footerReference w:type="first" r:id="rId15"/>
+      <w:headerReference w:type="even" r:id="rId11"/>
+      <w:headerReference w:type="default" r:id="rId12"/>
+      <w:footerReference w:type="even" r:id="rId13"/>
+      <w:footerReference w:type="default" r:id="rId14"/>
+      <w:headerReference w:type="first" r:id="rId15"/>
+      <w:footerReference w:type="first" r:id="rId16"/>
       <w:pgSz w:w="11906" w:h="16838"/>
       <w:pgMar w:top="1440" w:right="1440" w:bottom="1440" w:left="1440" w:header="708" w:footer="708" w:gutter="0"/>
       <w:cols w:space="708"/>
@@ -2081,9 +1204,6 @@
       <w:pBdr>
         <w:top w:val="single" w:sz="6" w:space="6" w:color="C4CED8"/>
       </w:pBdr>
-      <w:rPr>
-        <w:lang w:val="nl-BE"/>
-      </w:rPr>
     </w:pPr>
     <w:r>
       <w:rPr>
@@ -2159,9 +1279,103 @@
         <w:color w:val="59636E"/>
         <w:sz w:val="16"/>
         <w:szCs w:val="16"/>
-        <w:lang w:val="nl-BE"/>
-      </w:rPr>
-      <w:t xml:space="preserve">PARADISE-studie  ·  eCRF 46: Melding ongewenst voorval (AE/SAE) ·  Versie </w:t>
+      </w:rPr>
+      <w:t>PARADISE-</w:t>
+    </w:r>
+    <w:proofErr w:type="spellStart"/>
+    <w:proofErr w:type="gramStart"/>
+    <w:r>
+      <w:rPr>
+        <w:color w:val="59636E"/>
+        <w:sz w:val="16"/>
+        <w:szCs w:val="16"/>
+      </w:rPr>
+      <w:t>studie</w:t>
+    </w:r>
+    <w:proofErr w:type="spellEnd"/>
+    <w:r>
+      <w:rPr>
+        <w:color w:val="59636E"/>
+        <w:sz w:val="16"/>
+        <w:szCs w:val="16"/>
+      </w:rPr>
+      <w:t xml:space="preserve">  ·</w:t>
+    </w:r>
+    <w:proofErr w:type="gramEnd"/>
+    <w:r>
+      <w:rPr>
+        <w:color w:val="59636E"/>
+        <w:sz w:val="16"/>
+        <w:szCs w:val="16"/>
+      </w:rPr>
+      <w:t xml:space="preserve">  eCRF 46: Melding ongewenst voorval (AE/SAE)</w:t>
+    </w:r>
+    <w:proofErr w:type="spellStart"/>
+    <w:r>
+      <w:rPr>
+        <w:color w:val="59636E"/>
+        <w:sz w:val="16"/>
+        <w:szCs w:val="16"/>
+      </w:rPr>
+    </w:r>
+    <w:proofErr w:type="spellEnd"/>
+    <w:r>
+      <w:rPr>
+        <w:color w:val="59636E"/>
+        <w:sz w:val="16"/>
+        <w:szCs w:val="16"/>
+      </w:rPr>
+    </w:r>
+    <w:proofErr w:type="spellStart"/>
+    <w:r>
+      <w:rPr>
+        <w:color w:val="59636E"/>
+        <w:sz w:val="16"/>
+        <w:szCs w:val="16"/>
+      </w:rPr>
+    </w:r>
+    <w:proofErr w:type="spellEnd"/>
+    <w:r>
+      <w:rPr>
+        <w:color w:val="59636E"/>
+        <w:sz w:val="16"/>
+        <w:szCs w:val="16"/>
+      </w:rPr>
+    </w:r>
+    <w:proofErr w:type="spellStart"/>
+    <w:r>
+      <w:rPr>
+        <w:color w:val="59636E"/>
+        <w:sz w:val="16"/>
+        <w:szCs w:val="16"/>
+      </w:rPr>
+    </w:r>
+    <w:proofErr w:type="spellEnd"/>
+    <w:r>
+      <w:rPr>
+        <w:color w:val="59636E"/>
+        <w:sz w:val="16"/>
+        <w:szCs w:val="16"/>
+      </w:rPr>
+      <w:t xml:space="preserve"> </w:t>
+    </w:r>
+    <w:proofErr w:type="gramStart"/>
+    <w:r>
+      <w:rPr>
+        <w:color w:val="59636E"/>
+        <w:sz w:val="16"/>
+        <w:szCs w:val="16"/>
+      </w:rPr>
+      <w:t>·  Versie</w:t>
+    </w:r>
+    <w:proofErr w:type="gramEnd"/>
+    <w:r>
+      <w:rPr>
+        <w:color w:val="59636E"/>
+        <w:sz w:val="16"/>
+        <w:szCs w:val="16"/>
+      </w:rPr>
+      <w:t xml:space="preserve"> </w:t>
     </w:r>
     <w:r>
       <w:rPr>
@@ -2170,19 +1384,10 @@
         <w:color w:val="59636E"/>
         <w:sz w:val="16"/>
         <w:szCs w:val="16"/>
-        <w:lang w:val="nl-BE"/>
-      </w:rPr>
-      <w:t>[ 1.0 ]</w:t>
+      </w:rPr>
+      <w:t xml:space="preserve">[ </w:t>
     </w:r>
-    <w:r>
-      <w:rPr>
-        <w:color w:val="59636E"/>
-        <w:sz w:val="16"/>
-        <w:szCs w:val="16"/>
-        <w:lang w:val="nl-BE"/>
-      </w:rPr>
-      <w:t xml:space="preserve">  ·  </w:t>
-    </w:r>
+    <w:proofErr w:type="gramStart"/>
     <w:r>
       <w:rPr>
         <w:i/>
@@ -2190,25 +1395,132 @@
         <w:color w:val="59636E"/>
         <w:sz w:val="16"/>
         <w:szCs w:val="16"/>
-        <w:lang w:val="nl-BE"/>
-      </w:rPr>
-      <w:t>[ 03/08/2026 ]</w:t>
+      </w:rPr>
+      <w:t>1.0</w:t>
     </w:r>
     <w:r>
       <w:rPr>
+        <w:i/>
+        <w:iCs/>
         <w:color w:val="59636E"/>
         <w:sz w:val="16"/>
         <w:szCs w:val="16"/>
-        <w:lang w:val="nl-BE"/>
-      </w:rPr>
-      <w:t xml:space="preserve">  ·  Pagina </w:t>
+      </w:rPr>
+      <w:t xml:space="preserve"> ]</w:t>
     </w:r>
+    <w:proofErr w:type="gramEnd"/>
     <w:r>
       <w:rPr>
         <w:color w:val="59636E"/>
         <w:sz w:val="16"/>
         <w:szCs w:val="16"/>
       </w:rPr>
+      <w:t xml:space="preserve">  </w:t>
+    </w:r>
+    <w:proofErr w:type="gramStart"/>
+    <w:r>
+      <w:rPr>
+        <w:color w:val="59636E"/>
+        <w:sz w:val="16"/>
+        <w:szCs w:val="16"/>
+      </w:rPr>
+      <w:t xml:space="preserve">·  </w:t>
+    </w:r>
+    <w:r>
+      <w:rPr>
+        <w:i/>
+        <w:iCs/>
+        <w:color w:val="59636E"/>
+        <w:sz w:val="16"/>
+        <w:szCs w:val="16"/>
+      </w:rPr>
+      <w:t>[</w:t>
+    </w:r>
+    <w:proofErr w:type="gramEnd"/>
+    <w:r>
+      <w:rPr>
+        <w:i/>
+        <w:iCs/>
+        <w:color w:val="59636E"/>
+        <w:sz w:val="16"/>
+        <w:szCs w:val="16"/>
+      </w:rPr>
+      <w:t xml:space="preserve"> </w:t>
+    </w:r>
+    <w:r>
+      <w:rPr>
+        <w:i/>
+        <w:iCs/>
+        <w:color w:val="59636E"/>
+        <w:sz w:val="16"/>
+        <w:szCs w:val="16"/>
+      </w:rPr>
+      <w:t>03/08/</w:t>
+    </w:r>
+    <w:proofErr w:type="gramStart"/>
+    <w:r>
+      <w:rPr>
+        <w:i/>
+        <w:iCs/>
+        <w:color w:val="59636E"/>
+        <w:sz w:val="16"/>
+        <w:szCs w:val="16"/>
+      </w:rPr>
+      <w:t>2026</w:t>
+    </w:r>
+    <w:r>
+      <w:rPr>
+        <w:i/>
+        <w:iCs/>
+        <w:color w:val="59636E"/>
+        <w:sz w:val="16"/>
+        <w:szCs w:val="16"/>
+      </w:rPr>
+      <w:t xml:space="preserve"> ]</w:t>
+    </w:r>
+    <w:proofErr w:type="gramEnd"/>
+    <w:r>
+      <w:rPr>
+        <w:color w:val="59636E"/>
+        <w:sz w:val="16"/>
+        <w:szCs w:val="16"/>
+      </w:rPr>
+      <w:t xml:space="preserve">  </w:t>
+    </w:r>
+    <w:proofErr w:type="gramStart"/>
+    <w:r>
+      <w:rPr>
+        <w:color w:val="59636E"/>
+        <w:sz w:val="16"/>
+        <w:szCs w:val="16"/>
+      </w:rPr>
+      <w:t xml:space="preserve">·  </w:t>
+    </w:r>
+    <w:proofErr w:type="spellStart"/>
+    <w:r>
+      <w:rPr>
+        <w:color w:val="59636E"/>
+        <w:sz w:val="16"/>
+        <w:szCs w:val="16"/>
+      </w:rPr>
+      <w:t>Pagina</w:t>
+    </w:r>
+    <w:proofErr w:type="spellEnd"/>
+    <w:proofErr w:type="gramEnd"/>
+    <w:r>
+      <w:rPr>
+        <w:color w:val="59636E"/>
+        <w:sz w:val="16"/>
+        <w:szCs w:val="16"/>
+      </w:rPr>
+      <w:t xml:space="preserve"> </w:t>
+    </w:r>
+    <w:r>
+      <w:rPr>
+        <w:color w:val="59636E"/>
+        <w:sz w:val="16"/>
+        <w:szCs w:val="16"/>
+      </w:rPr>
       <w:fldChar w:fldCharType="begin"/>
     </w:r>
     <w:r>
@@ -2216,7 +1528,6 @@
         <w:color w:val="59636E"/>
         <w:sz w:val="16"/>
         <w:szCs w:val="16"/>
-        <w:lang w:val="nl-BE"/>
       </w:rPr>
       <w:instrText>PAGE</w:instrText>
     </w:r>
@@ -2234,7 +1545,6 @@
         <w:color w:val="59636E"/>
         <w:sz w:val="16"/>
         <w:szCs w:val="16"/>
-        <w:lang w:val="nl-BE"/>
       </w:rPr>
       <w:t>1</w:t>
     </w:r>
@@ -2251,7 +1561,6 @@
         <w:color w:val="59636E"/>
         <w:sz w:val="16"/>
         <w:szCs w:val="16"/>
-        <w:lang w:val="nl-BE"/>
       </w:rPr>
       <w:t xml:space="preserve"> van </w:t>
     </w:r>
@@ -2268,7 +1577,6 @@
         <w:color w:val="59636E"/>
         <w:sz w:val="16"/>
         <w:szCs w:val="16"/>
-        <w:lang w:val="nl-BE"/>
       </w:rPr>
       <w:instrText>NUMPAGES</w:instrText>
     </w:r>
@@ -2286,7 +1594,6 @@
         <w:color w:val="59636E"/>
         <w:sz w:val="16"/>
         <w:szCs w:val="16"/>
-        <w:lang w:val="nl-BE"/>
       </w:rPr>
       <w:t>2</w:t>
     </w:r>
@@ -5929,21 +5236,6 @@
 </file>
 
 <file path=customXml/item1.xml><?xml version="1.0" encoding="utf-8"?>
-<p:properties xmlns:p="http://schemas.microsoft.com/office/2006/metadata/properties" xmlns:xsi="http://www.w3.org/2001/XMLSchema-instance" xmlns:pc="http://schemas.microsoft.com/office/infopath/2007/PartnerControls">
-  <documentManagement/>
-</p:properties>
-</file>
-
-<file path=customXml/item2.xml><?xml version="1.0" encoding="utf-8"?>
-<?mso-contentType ?>
-<FormTemplates xmlns="http://schemas.microsoft.com/sharepoint/v3/contenttype/forms">
-  <Display>DocumentLibraryForm</Display>
-  <Edit>DocumentLibraryForm</Edit>
-  <New>DocumentLibraryForm</New>
-</FormTemplates>
-</file>
-
-<file path=customXml/item3.xml><?xml version="1.0" encoding="utf-8"?>
 <ct:contentTypeSchema xmlns:ct="http://schemas.microsoft.com/office/2006/metadata/contentType" xmlns:ma="http://schemas.microsoft.com/office/2006/metadata/properties/metaAttributes" ct:_="" ma:_="" ma:contentTypeName="Document" ma:contentTypeID="0x010100F1B33D7B57FFEC4BB77B5001C5B93838" ma:contentTypeVersion="6" ma:contentTypeDescription="Een nieuw document maken." ma:contentTypeScope="" ma:versionID="59579db12405a868ad0e92c5e4f74ae1">
   <xsd:schema xmlns:xsd="http://www.w3.org/2001/XMLSchema" xmlns:xs="http://www.w3.org/2001/XMLSchema" xmlns:p="http://schemas.microsoft.com/office/2006/metadata/properties" xmlns:ns2="f44e6bd5-09db-4117-8b15-adf399208dc6" targetNamespace="http://schemas.microsoft.com/office/2006/metadata/properties" ma:root="true" ma:fieldsID="98cf673e6ff17a9b7a889e3f7df574b2" ns2:_="">
     <xsd:import namespace="f44e6bd5-09db-4117-8b15-adf399208dc6"/>
@@ -6099,24 +5391,22 @@
 </ct:contentTypeSchema>
 </file>
 
-<file path=customXml/itemProps1.xml><?xml version="1.0" encoding="utf-8"?>
-<ds:datastoreItem xmlns:ds="http://schemas.openxmlformats.org/officeDocument/2006/customXml" ds:itemID="{CBF80127-1B05-49DA-A759-4FDCF3717CEE}">
-  <ds:schemaRefs>
-    <ds:schemaRef ds:uri="http://schemas.microsoft.com/office/2006/metadata/properties"/>
-    <ds:schemaRef ds:uri="http://schemas.microsoft.com/office/infopath/2007/PartnerControls"/>
-  </ds:schemaRefs>
-</ds:datastoreItem>
+<file path=customXml/item2.xml><?xml version="1.0" encoding="utf-8"?>
+<?mso-contentType ?>
+<FormTemplates xmlns="http://schemas.microsoft.com/sharepoint/v3/contenttype/forms">
+  <Display>DocumentLibraryForm</Display>
+  <Edit>DocumentLibraryForm</Edit>
+  <New>DocumentLibraryForm</New>
+</FormTemplates>
 </file>
 
-<file path=customXml/itemProps2.xml><?xml version="1.0" encoding="utf-8"?>
-<ds:datastoreItem xmlns:ds="http://schemas.openxmlformats.org/officeDocument/2006/customXml" ds:itemID="{73A78AB4-193A-4871-8D7E-B02A4D26C775}">
-  <ds:schemaRefs>
-    <ds:schemaRef ds:uri="http://schemas.microsoft.com/sharepoint/v3/contenttype/forms"/>
-  </ds:schemaRefs>
-</ds:datastoreItem>
+<file path=customXml/item3.xml><?xml version="1.0" encoding="utf-8"?>
+<p:properties xmlns:p="http://schemas.microsoft.com/office/2006/metadata/properties" xmlns:xsi="http://www.w3.org/2001/XMLSchema-instance" xmlns:pc="http://schemas.microsoft.com/office/infopath/2007/PartnerControls">
+  <documentManagement/>
+</p:properties>
 </file>
 
-<file path=customXml/itemProps3.xml><?xml version="1.0" encoding="utf-8"?>
+<file path=customXml/itemProps1.xml><?xml version="1.0" encoding="utf-8"?>
 <ds:datastoreItem xmlns:ds="http://schemas.openxmlformats.org/officeDocument/2006/customXml" ds:itemID="{742DD1AB-99B5-41AB-AAF9-B7AE5E09AA56}">
   <ds:schemaRefs>
     <ds:schemaRef ds:uri="http://schemas.microsoft.com/office/2006/metadata/contentType"/>
@@ -6132,4 +5422,21 @@
     <ds:schemaRef ds:uri="http://schemas.microsoft.com/internal/obd"/>
   </ds:schemaRefs>
 </ds:datastoreItem>
+</file>
+
+<file path=customXml/itemProps2.xml><?xml version="1.0" encoding="utf-8"?>
+<ds:datastoreItem xmlns:ds="http://schemas.openxmlformats.org/officeDocument/2006/customXml" ds:itemID="{73A78AB4-193A-4871-8D7E-B02A4D26C775}">
+  <ds:schemaRefs>
+    <ds:schemaRef ds:uri="http://schemas.microsoft.com/sharepoint/v3/contenttype/forms"/>
+  </ds:schemaRefs>
+</ds:datastoreItem>
+</file>
+
+<file path=customXml/itemProps3.xml><?xml version="1.0" encoding="utf-8"?>
+<ds:datastoreItem xmlns:ds="http://schemas.openxmlformats.org/officeDocument/2006/customXml" ds:itemID="{CBF80127-1B05-49DA-A759-4FDCF3717CEE}">
+  <ds:schemaRefs>
+    <ds:schemaRef ds:uri="http://schemas.microsoft.com/office/2006/metadata/properties"/>
+    <ds:schemaRef ds:uri="http://schemas.microsoft.com/office/infopath/2007/PartnerControls"/>
+  </ds:schemaRefs>
+</ds:datastoreItem>
 </file>
</xml_diff>